<commit_message>
react y node funcionando
</commit_message>
<xml_diff>
--- a/_docs_/prompt.docx
+++ b/_docs_/prompt.docx
@@ -93,185 +93,6 @@
     <w:p>
       <w:r>
         <w:t>VITE v8.0.7</w:t>
-      </w:r>
-    </w:p>
-    <w:p>
-      <w:pPr>
-        <w:pBdr>
-          <w:bottom w:val="single" w:sz="12" w:space="1" w:color="auto"/>
-        </w:pBdr>
-      </w:pPr>
-    </w:p>
-    <w:p>
-      <w:pPr>
-        <w:pStyle w:val="Prrafodelista"/>
-        <w:numPr>
-          <w:ilvl w:val="0"/>
-          <w:numId w:val="2"/>
-        </w:numPr>
-      </w:pPr>
-      <w:r>
-        <w:t>Reconocer el funcionamiento de JSON SERVER</w:t>
-      </w:r>
-    </w:p>
-    <w:p>
-      <w:pPr>
-        <w:pStyle w:val="Prrafodelista"/>
-        <w:numPr>
-          <w:ilvl w:val="1"/>
-          <w:numId w:val="2"/>
-        </w:numPr>
-      </w:pPr>
-      <w:r>
-        <w:t xml:space="preserve">Instalación de </w:t>
-      </w:r>
-      <w:proofErr w:type="spellStart"/>
-      <w:r>
-        <w:t>Node</w:t>
-      </w:r>
-      <w:proofErr w:type="spellEnd"/>
-    </w:p>
-    <w:p>
-      <w:pPr>
-        <w:pStyle w:val="Prrafodelista"/>
-        <w:numPr>
-          <w:ilvl w:val="1"/>
-          <w:numId w:val="2"/>
-        </w:numPr>
-      </w:pPr>
-      <w:r>
-        <w:t xml:space="preserve">Instalación de </w:t>
-      </w:r>
-      <w:proofErr w:type="spellStart"/>
-      <w:r>
-        <w:t>Postman</w:t>
-      </w:r>
-      <w:proofErr w:type="spellEnd"/>
-      <w:r>
-        <w:t xml:space="preserve"> (</w:t>
-      </w:r>
-      <w:proofErr w:type="spellStart"/>
-      <w:r>
-        <w:t>EndPoint</w:t>
-      </w:r>
-      <w:proofErr w:type="spellEnd"/>
-      <w:r>
-        <w:t xml:space="preserve"> – Métodos: </w:t>
-      </w:r>
-      <w:r>
-        <w:rPr>
-          <w:b/>
-          <w:bCs/>
-        </w:rPr>
-        <w:t>C</w:t>
-      </w:r>
-      <w:r>
-        <w:t xml:space="preserve">-POST, </w:t>
-      </w:r>
-      <w:r>
-        <w:rPr>
-          <w:b/>
-          <w:bCs/>
-        </w:rPr>
-        <w:t>R</w:t>
-      </w:r>
-      <w:r>
-        <w:t xml:space="preserve">-GET, </w:t>
-      </w:r>
-      <w:r>
-        <w:rPr>
-          <w:b/>
-          <w:bCs/>
-        </w:rPr>
-        <w:t>U</w:t>
-      </w:r>
-      <w:r>
-        <w:t xml:space="preserve">-PUT, U-PATCH, </w:t>
-      </w:r>
-      <w:r>
-        <w:rPr>
-          <w:b/>
-          <w:bCs/>
-        </w:rPr>
-        <w:t>D</w:t>
-      </w:r>
-      <w:r>
-        <w:t>-</w:t>
-      </w:r>
-      <w:r>
-        <w:t>DELETE)</w:t>
-      </w:r>
-    </w:p>
-    <w:p>
-      <w:pPr>
-        <w:pStyle w:val="Prrafodelista"/>
-        <w:numPr>
-          <w:ilvl w:val="0"/>
-          <w:numId w:val="2"/>
-        </w:numPr>
-      </w:pPr>
-      <w:r>
-        <w:t>Convertir la base de datos SQL a NoSQL (</w:t>
-      </w:r>
-      <w:proofErr w:type="gramStart"/>
-      <w:r>
-        <w:t>*.</w:t>
-      </w:r>
-      <w:proofErr w:type="spellStart"/>
-      <w:r>
-        <w:t>json</w:t>
-      </w:r>
-      <w:proofErr w:type="spellEnd"/>
-      <w:proofErr w:type="gramEnd"/>
-      <w:r>
-        <w:t>)</w:t>
-      </w:r>
-    </w:p>
-    <w:p>
-      <w:pPr>
-        <w:pStyle w:val="Prrafodelista"/>
-        <w:numPr>
-          <w:ilvl w:val="0"/>
-          <w:numId w:val="2"/>
-        </w:numPr>
-      </w:pPr>
-      <w:r>
-        <w:t xml:space="preserve">Conectar el </w:t>
-      </w:r>
-      <w:proofErr w:type="spellStart"/>
-      <w:r>
-        <w:t>Frontend</w:t>
-      </w:r>
-      <w:proofErr w:type="spellEnd"/>
-      <w:r>
-        <w:t xml:space="preserve"> con la </w:t>
-      </w:r>
-      <w:proofErr w:type="spellStart"/>
-      <w:proofErr w:type="gramStart"/>
-      <w:r>
-        <w:t>db.json</w:t>
-      </w:r>
-      <w:proofErr w:type="spellEnd"/>
-      <w:proofErr w:type="gramEnd"/>
-    </w:p>
-    <w:p>
-      <w:pPr>
-        <w:pStyle w:val="Prrafodelista"/>
-        <w:numPr>
-          <w:ilvl w:val="0"/>
-          <w:numId w:val="2"/>
-        </w:numPr>
-      </w:pPr>
-      <w:r>
-        <w:t>Almacenar el JWT en el Navegador (</w:t>
-      </w:r>
-      <w:proofErr w:type="spellStart"/>
-      <w:r>
-        <w:t>LocalStorage</w:t>
-      </w:r>
-      <w:proofErr w:type="spellEnd"/>
-      <w:r>
-        <w:t>)</w:t>
       </w:r>
     </w:p>
     <w:sectPr>

</xml_diff>